<commit_message>
Revise voice: add detective-novel + wry-humor style to STYLE.md; rewrite Ch22 (Burch) as prototype
- STYLE.md: new Voice and tone section - old-detective-novel description,
  comparatives woven in, humor aimed only at the criminal's blunders
  (never the victim), page-turner endings
- ch22 'Twelve Steps' rewritten as the style prototype for approval
  before rolling the voice across all chapters

Co-Authored-By: Claude Opus 4.8 <noreply@anthropic.com>
Claude-Session: https://claude.ai/code/session_016HAHAXcMmaZghEz1kJrDWU
</commit_message>
<xml_diff>
--- a/book/word/Ch22 - Twelve Steps.docx
+++ b/book/word/Ch22 - Twelve Steps.docx
@@ -2,7 +2,7 @@
 <file path=word/document.xml><?xml version="1.0" encoding="utf-8"?>
 <w:document xmlns:w="http://schemas.openxmlformats.org/wordprocessingml/2006/main" xmlns:m="http://schemas.openxmlformats.org/officeDocument/2006/math" xmlns:r="http://schemas.openxmlformats.org/officeDocument/2006/relationships" xmlns:o="urn:schemas-microsoft-com:office:office" xmlns:v="urn:schemas-microsoft-com:vml" xmlns:w10="urn:schemas-microsoft-com:office:word" xmlns:a="http://schemas.openxmlformats.org/drawingml/2006/main" xmlns:pic="http://schemas.openxmlformats.org/drawingml/2006/picture" xmlns:wp="http://schemas.openxmlformats.org/drawingml/2006/wordprocessingDrawing">
   <w:body>
-    <w:bookmarkStart w:id="27" w:name="chapter-22---twelve-steps"/>
+    <w:bookmarkStart w:id="29" w:name="chapter-22---twelve-steps"/>
     <w:p>
       <w:pPr>
         <w:pStyle w:val="Heading1"/>
@@ -20,7 +20,7 @@
           <w:bCs/>
           <w:b/>
         </w:rPr>
-        <w:t xml:space="preserve">The Fitbit cleared the boyfriend. A cellphone handed over in a fender-bender</w:t>
+        <w:t xml:space="preserve">A Fitbit cleared the boyfriend. Then the real killer walked into a police</w:t>
       </w:r>
       <w:r>
         <w:rPr>
@@ -34,7 +34,7 @@
           <w:bCs/>
           <w:b/>
         </w:rPr>
-        <w:t xml:space="preserve">case buried the man who did it.</w:t>
+        <w:t xml:space="preserve">station, over a fender-bender, and handed the cops his own phone.</w:t>
       </w:r>
     </w:p>
     <w:p>
@@ -42,13 +42,31 @@
         <w:pStyle w:val="BodyText"/>
       </w:pPr>
       <w:r>
-        <w:t xml:space="preserve">When police find a woman murdered, they look first at the man she loved. It is</w:t>
-      </w:r>
-      <w:r>
-        <w:t xml:space="preserve"> </w:t>
-      </w:r>
-      <w:r>
-        <w:t xml:space="preserve">grim arithmetic, but it is arithmetic that usually works.</w:t>
+        <w:t xml:space="preserve">Every homicide detective starts with the same short list, and the name at the</w:t>
+      </w:r>
+      <w:r>
+        <w:t xml:space="preserve"> </w:t>
+      </w:r>
+      <w:r>
+        <w:t xml:space="preserve">top is almost always the last man to share the victim’s bed. It is not</w:t>
+      </w:r>
+      <w:r>
+        <w:t xml:space="preserve"> </w:t>
+      </w:r>
+      <w:r>
+        <w:t xml:space="preserve">prejudice. It is arithmetic. Most people are killed by someone who loved them,</w:t>
+      </w:r>
+      <w:r>
+        <w:t xml:space="preserve"> </w:t>
+      </w:r>
+      <w:r>
+        <w:t xml:space="preserve">or claimed to, and the odds have closed a lot of cases before the coffee got</w:t>
+      </w:r>
+      <w:r>
+        <w:t xml:space="preserve"> </w:t>
+      </w:r>
+      <w:r>
+        <w:t xml:space="preserve">cold.</w:t>
       </w:r>
     </w:p>
     <w:p>
@@ -56,25 +74,49 @@
         <w:pStyle w:val="BodyText"/>
       </w:pPr>
       <w:r>
-        <w:t xml:space="preserve">On the night of May 20, 2016, Nicole VanderHeyden went to a bar near Green Bay,</w:t>
-      </w:r>
-      <w:r>
-        <w:t xml:space="preserve"> </w:t>
-      </w:r>
-      <w:r>
-        <w:t xml:space="preserve">Wisconsin, with her boyfriend, Douglass Detrie. They got separated. A phone</w:t>
-      </w:r>
-      <w:r>
-        <w:t xml:space="preserve"> </w:t>
-      </w:r>
-      <w:r>
-        <w:t xml:space="preserve">call and a string of text messages turned into an argument, and Detrie went</w:t>
-      </w:r>
-      <w:r>
-        <w:t xml:space="preserve"> </w:t>
-      </w:r>
-      <w:r>
-        <w:t xml:space="preserve">home alone to the house they shared.</w:t>
+        <w:t xml:space="preserve">So when Nicole VanderHeyden turned up dead in a field outside Green Bay,</w:t>
+      </w:r>
+      <w:r>
+        <w:t xml:space="preserve"> </w:t>
+      </w:r>
+      <w:r>
+        <w:t xml:space="preserve">Wisconsin, on the morning of May 21, 2016, the arithmetic pointed where it</w:t>
+      </w:r>
+      <w:r>
+        <w:t xml:space="preserve"> </w:t>
+      </w:r>
+      <w:r>
+        <w:t xml:space="preserve">always points. The night before, she had gone drinking with her boyfriend,</w:t>
+      </w:r>
+      <w:r>
+        <w:t xml:space="preserve"> </w:t>
+      </w:r>
+      <w:r>
+        <w:t xml:space="preserve">Douglass Detrie. They had gotten separated, then tangled up in one of those</w:t>
+      </w:r>
+      <w:r>
+        <w:t xml:space="preserve"> </w:t>
+      </w:r>
+      <w:r>
+        <w:t xml:space="preserve">long, poisonous arguments that ricochet across a phone in calls and texts.</w:t>
+      </w:r>
+      <w:r>
+        <w:t xml:space="preserve"> </w:t>
+      </w:r>
+      <w:r>
+        <w:t xml:space="preserve">Detrie went home alone. By morning Nicole was lying next to a field, her</w:t>
+      </w:r>
+      <w:r>
+        <w:t xml:space="preserve"> </w:t>
+      </w:r>
+      <w:r>
+        <w:t xml:space="preserve">blood-stained clothes dumped along a freeway on-ramp, some of her blood and</w:t>
+      </w:r>
+      <w:r>
+        <w:t xml:space="preserve"> </w:t>
+      </w:r>
+      <w:r>
+        <w:t xml:space="preserve">hair left outside a neighbor’s house like a trail nobody was meant to follow.</w:t>
       </w:r>
     </w:p>
     <w:p>
@@ -82,31 +124,19 @@
         <w:pStyle w:val="BodyText"/>
       </w:pPr>
       <w:r>
-        <w:t xml:space="preserve">The next day, Nicole’s body was discovered next to a field. Her blood-stained</w:t>
-      </w:r>
-      <w:r>
-        <w:t xml:space="preserve"> </w:t>
-      </w:r>
-      <w:r>
-        <w:t xml:space="preserve">clothing turned up discarded along a freeway on-ramp. Some of her blood and</w:t>
-      </w:r>
-      <w:r>
-        <w:t xml:space="preserve"> </w:t>
-      </w:r>
-      <w:r>
-        <w:t xml:space="preserve">hair was found outside a neighbor’s house. The Brown County Sheriff’s Office</w:t>
-      </w:r>
-      <w:r>
-        <w:t xml:space="preserve"> </w:t>
-      </w:r>
-      <w:r>
-        <w:t xml:space="preserve">opened a homicide investigation, and the grim arithmetic did its work: Detrie,</w:t>
-      </w:r>
-      <w:r>
-        <w:t xml:space="preserve"> </w:t>
-      </w:r>
-      <w:r>
-        <w:t xml:space="preserve">the boyfriend, the argument, the last man with her, became the first suspect.</w:t>
+        <w:t xml:space="preserve">The Brown County Sheriff’s Office did the math and looked hard at the boyfriend.</w:t>
+      </w:r>
+      <w:r>
+        <w:t xml:space="preserve"> </w:t>
+      </w:r>
+      <w:r>
+        <w:t xml:space="preserve">Motive, opportunity, a bad night that ended with a dead woman. It was a tidy</w:t>
+      </w:r>
+      <w:r>
+        <w:t xml:space="preserve"> </w:t>
+      </w:r>
+      <w:r>
+        <w:t xml:space="preserve">theory.</w:t>
       </w:r>
     </w:p>
     <w:p>
@@ -114,7 +144,42 @@
         <w:pStyle w:val="BodyText"/>
       </w:pPr>
       <w:r>
-        <w:t xml:space="preserve">Then investigators looked at his wrist.</w:t>
+        <w:t xml:space="preserve">Then a detective looked at Detrie’s wrist.</w:t>
+      </w:r>
+    </w:p>
+    <w:bookmarkStart w:id="20" w:name="twelve-steps"/>
+    <w:p>
+      <w:pPr>
+        <w:pStyle w:val="Heading2"/>
+      </w:pPr>
+      <w:r>
+        <w:t xml:space="preserve">Twelve steps</w:t>
+      </w:r>
+    </w:p>
+    <w:p>
+      <w:pPr>
+        <w:pStyle w:val="FirstParagraph"/>
+      </w:pPr>
+      <w:r>
+        <w:t xml:space="preserve">Detrie wore a Fitbit Flex, one of those little rubber bands that spends its</w:t>
+      </w:r>
+      <w:r>
+        <w:t xml:space="preserve"> </w:t>
+      </w:r>
+      <w:r>
+        <w:t xml:space="preserve">whole existence doing exactly one thing: counting the steps of the person</w:t>
+      </w:r>
+      <w:r>
+        <w:t xml:space="preserve"> </w:t>
+      </w:r>
+      <w:r>
+        <w:t xml:space="preserve">wearing it, tireless and dumb as a turnstile. It does not care whether you are</w:t>
+      </w:r>
+      <w:r>
+        <w:t xml:space="preserve"> </w:t>
+      </w:r>
+      <w:r>
+        <w:t xml:space="preserve">running a marathon or asleep on the couch. It just counts.</w:t>
       </w:r>
     </w:p>
     <w:p>
@@ -122,19 +187,297 @@
         <w:pStyle w:val="BodyText"/>
       </w:pPr>
       <w:r>
-        <w:t xml:space="preserve">Detrie wore a Fitbit Flex, a small band that does nothing but count its</w:t>
-      </w:r>
-      <w:r>
-        <w:t xml:space="preserve"> </w:t>
-      </w:r>
-      <w:r>
-        <w:t xml:space="preserve">wearer’s steps, hour after hour, whether or not anyone ever asks. During the</w:t>
-      </w:r>
-      <w:r>
-        <w:t xml:space="preserve"> </w:t>
-      </w:r>
-      <w:r>
-        <w:t xml:space="preserve">hours of Nicole VanderHeyden’s death, Detrie’s Fitbit logged</w:t>
+        <w:t xml:space="preserve">During the hours Nicole VanderHeyden was being beaten to death, moved to a</w:t>
+      </w:r>
+      <w:r>
+        <w:t xml:space="preserve"> </w:t>
+      </w:r>
+      <w:r>
+        <w:t xml:space="preserve">field, and scattered along a freeway, Douglass Detrie’s Fitbit counted twelve</w:t>
+      </w:r>
+      <w:r>
+        <w:t xml:space="preserve"> </w:t>
+      </w:r>
+      <w:r>
+        <w:t xml:space="preserve">steps.</w:t>
+      </w:r>
+    </w:p>
+    <w:p>
+      <w:pPr>
+        <w:pStyle w:val="BodyText"/>
+      </w:pPr>
+      <w:r>
+        <w:t xml:space="preserve">Twelve. That is a man getting up to find the bathroom in the dark. It is not a</w:t>
+      </w:r>
+      <w:r>
+        <w:t xml:space="preserve"> </w:t>
+      </w:r>
+      <w:r>
+        <w:t xml:space="preserve">man committing a murder that involved carrying a body and driving across town to</w:t>
+      </w:r>
+      <w:r>
+        <w:t xml:space="preserve"> </w:t>
+      </w:r>
+      <w:r>
+        <w:t xml:space="preserve">lose the evidence. You cannot strangle someone, load them into a car, and redecorate</w:t>
+      </w:r>
+      <w:r>
+        <w:t xml:space="preserve"> </w:t>
+      </w:r>
+      <w:r>
+        <w:t xml:space="preserve">a crime scene in twelve steps; you can barely reach the refrigerator. The</w:t>
+      </w:r>
+      <w:r>
+        <w:t xml:space="preserve"> </w:t>
+      </w:r>
+      <w:r>
+        <w:t xml:space="preserve">smallest, cheapest gadget in the case had just given the prime suspect the one</w:t>
+      </w:r>
+      <w:r>
+        <w:t xml:space="preserve"> </w:t>
+      </w:r>
+      <w:r>
+        <w:t xml:space="preserve">thing money usually buys and innocence rarely can: an airtight alibi, printed by</w:t>
+      </w:r>
+      <w:r>
+        <w:t xml:space="preserve"> </w:t>
+      </w:r>
+      <w:r>
+        <w:t xml:space="preserve">a machine with no reason to lie.</w:t>
+      </w:r>
+    </w:p>
+    <w:p>
+      <w:pPr>
+        <w:pStyle w:val="BodyText"/>
+      </w:pPr>
+      <w:r>
+        <w:t xml:space="preserve">The tidy theory collapsed. And for months, the investigation had nowhere left to</w:t>
+      </w:r>
+      <w:r>
+        <w:t xml:space="preserve"> </w:t>
+      </w:r>
+      <w:r>
+        <w:t xml:space="preserve">go.</w:t>
+      </w:r>
+    </w:p>
+    <w:bookmarkEnd w:id="20"/>
+    <w:bookmarkStart w:id="21" w:name="the-gift-wrapped-suspect"/>
+    <w:p>
+      <w:pPr>
+        <w:pStyle w:val="Heading2"/>
+      </w:pPr>
+      <w:r>
+        <w:t xml:space="preserve">The gift-wrapped suspect</w:t>
+      </w:r>
+    </w:p>
+    <w:p>
+      <w:pPr>
+        <w:pStyle w:val="FirstParagraph"/>
+      </w:pPr>
+      <w:r>
+        <w:t xml:space="preserve">Here is where the story stops being a tragedy for a moment and becomes something</w:t>
+      </w:r>
+      <w:r>
+        <w:t xml:space="preserve"> </w:t>
+      </w:r>
+      <w:r>
+        <w:t xml:space="preserve">you’d expect narrated over a laugh track, because the man who killed Nicole</w:t>
+      </w:r>
+      <w:r>
+        <w:t xml:space="preserve"> </w:t>
+      </w:r>
+      <w:r>
+        <w:t xml:space="preserve">VanderHeyden had already handed the police everything they needed to convict</w:t>
+      </w:r>
+      <w:r>
+        <w:t xml:space="preserve"> </w:t>
+      </w:r>
+      <w:r>
+        <w:t xml:space="preserve">him. He just hadn’t gotten around to it yet.</w:t>
+      </w:r>
+    </w:p>
+    <w:p>
+      <w:pPr>
+        <w:pStyle w:val="BodyText"/>
+      </w:pPr>
+      <w:r>
+        <w:t xml:space="preserve">Rewind three weeks. Across town, the Green Bay Police Department, a completely</w:t>
+      </w:r>
+      <w:r>
+        <w:t xml:space="preserve"> </w:t>
+      </w:r>
+      <w:r>
+        <w:t xml:space="preserve">different outfit working a completely different file, was chasing a small-time</w:t>
+      </w:r>
+      <w:r>
+        <w:t xml:space="preserve"> </w:t>
+      </w:r>
+      <w:r>
+        <w:t xml:space="preserve">mess involving one vehicle and three headaches: a stolen-car report, a car</w:t>
+      </w:r>
+      <w:r>
+        <w:t xml:space="preserve"> </w:t>
+      </w:r>
+      <w:r>
+        <w:t xml:space="preserve">fire, and a hit-and-run. Their guy was a man named George Burch. An officer sat</w:t>
+      </w:r>
+      <w:r>
+        <w:t xml:space="preserve"> </w:t>
+      </w:r>
+      <w:r>
+        <w:t xml:space="preserve">Burch down and, checking his alibi, asked if he could take a look at the text</w:t>
+      </w:r>
+      <w:r>
+        <w:t xml:space="preserve"> </w:t>
+      </w:r>
+      <w:r>
+        <w:t xml:space="preserve">messages on his phone.</w:t>
+      </w:r>
+    </w:p>
+    <w:p>
+      <w:pPr>
+        <w:pStyle w:val="BodyText"/>
+      </w:pPr>
+      <w:r>
+        <w:t xml:space="preserve">Burch said sure.</w:t>
+      </w:r>
+    </w:p>
+    <w:p>
+      <w:pPr>
+        <w:pStyle w:val="BodyText"/>
+      </w:pPr>
+      <w:r>
+        <w:t xml:space="preserve">Not only sure. When the officer explained it would be easier to just download</w:t>
+      </w:r>
+      <w:r>
+        <w:t xml:space="preserve"> </w:t>
+      </w:r>
+      <w:r>
+        <w:t xml:space="preserve">the whole phone than to sit there photographing the screen like it was 1995,</w:t>
+      </w:r>
+      <w:r>
+        <w:t xml:space="preserve"> </w:t>
+      </w:r>
+      <w:r>
+        <w:t xml:space="preserve">Burch agreed to that too, and signed a consent form to prove it:</w:t>
+      </w:r>
+      <w:r>
+        <w:t xml:space="preserve"> </w:t>
+      </w:r>
+      <w:r>
+        <w:t xml:space="preserve">“</w:t>
+      </w:r>
+      <w:r>
+        <w:t xml:space="preserve">I, George</w:t>
+      </w:r>
+      <w:r>
+        <w:t xml:space="preserve"> </w:t>
+      </w:r>
+      <w:r>
+        <w:t xml:space="preserve">Stephen Burch . . . voluntarily give . . . permission to search my . . . Samsung</w:t>
+      </w:r>
+      <w:r>
+        <w:t xml:space="preserve"> </w:t>
+      </w:r>
+      <w:r>
+        <w:t xml:space="preserve">cellphone.</w:t>
+      </w:r>
+      <w:r>
+        <w:t xml:space="preserve">”</w:t>
+      </w:r>
+      <w:r>
+        <w:t xml:space="preserve"> </w:t>
+      </w:r>
+      <w:r>
+        <w:t xml:space="preserve">The department’s forensic examiner did what examiners do when handed</w:t>
+      </w:r>
+      <w:r>
+        <w:t xml:space="preserve"> </w:t>
+      </w:r>
+      <w:r>
+        <w:t xml:space="preserve">a signed permission slip: he vacuumed the entire device, every byte, and filed</w:t>
+      </w:r>
+      <w:r>
+        <w:t xml:space="preserve"> </w:t>
+      </w:r>
+      <w:r>
+        <w:t xml:space="preserve">the copy away in long-term storage. Burch got his phone back and went on with</w:t>
+      </w:r>
+      <w:r>
+        <w:t xml:space="preserve"> </w:t>
+      </w:r>
+      <w:r>
+        <w:t xml:space="preserve">his life, presumably relieved to have been so cooperative.</w:t>
+      </w:r>
+    </w:p>
+    <w:p>
+      <w:pPr>
+        <w:pStyle w:val="BodyText"/>
+      </w:pPr>
+      <w:r>
+        <w:t xml:space="preserve">The download sat in a drawer, quietly holding a confession nobody had read yet.</w:t>
+      </w:r>
+    </w:p>
+    <w:bookmarkEnd w:id="21"/>
+    <w:bookmarkStart w:id="22" w:name="what-the-drawer-was-holding"/>
+    <w:p>
+      <w:pPr>
+        <w:pStyle w:val="Heading2"/>
+      </w:pPr>
+      <w:r>
+        <w:t xml:space="preserve">What the drawer was holding</w:t>
+      </w:r>
+    </w:p>
+    <w:p>
+      <w:pPr>
+        <w:pStyle w:val="FirstParagraph"/>
+      </w:pPr>
+      <w:r>
+        <w:t xml:space="preserve">Two months later, the Sheriff’s Office, still stuck on the VanderHeyden case,</w:t>
+      </w:r>
+      <w:r>
+        <w:t xml:space="preserve"> </w:t>
+      </w:r>
+      <w:r>
+        <w:t xml:space="preserve">finally caught a break the old-fashioned way: DNA on Nicole’s sock came back to</w:t>
+      </w:r>
+      <w:r>
+        <w:t xml:space="preserve"> </w:t>
+      </w:r>
+      <w:r>
+        <w:t xml:space="preserve">George Burch. The detectives ran his name through the local records to see if</w:t>
+      </w:r>
+      <w:r>
+        <w:t xml:space="preserve"> </w:t>
+      </w:r>
+      <w:r>
+        <w:t xml:space="preserve">anyone had ever crossed paths with him, and up popped the Green Bay file, the</w:t>
+      </w:r>
+      <w:r>
+        <w:t xml:space="preserve"> </w:t>
+      </w:r>
+      <w:r>
+        <w:t xml:space="preserve">one about the stolen car and the fire, with a signed consent form stapled to a</w:t>
+      </w:r>
+      <w:r>
+        <w:t xml:space="preserve"> </w:t>
+      </w:r>
+      <w:r>
+        <w:t xml:space="preserve">complete mirror image of his phone.</w:t>
+      </w:r>
+    </w:p>
+    <w:p>
+      <w:pPr>
+        <w:pStyle w:val="BodyText"/>
+      </w:pPr>
+      <w:r>
+        <w:t xml:space="preserve">They opened it. And there, in the browser history, was the detail that should be</w:t>
+      </w:r>
+      <w:r>
+        <w:t xml:space="preserve"> </w:t>
+      </w:r>
+      <w:r>
+        <w:t xml:space="preserve">taught in schools:</w:t>
       </w:r>
       <w:r>
         <w:t xml:space="preserve"> </w:t>
@@ -144,10 +487,39 @@
           <w:bCs/>
           <w:b/>
         </w:rPr>
-        <w:t xml:space="preserve">twelve steps</w:t>
-      </w:r>
-      <w:r>
-        <w:t xml:space="preserve">.</w:t>
+        <w:t xml:space="preserve">sixty-four separate visits to news stories about Nicole</w:t>
+      </w:r>
+      <w:r>
+        <w:rPr>
+          <w:bCs/>
+          <w:b/>
+        </w:rPr>
+        <w:t xml:space="preserve"> </w:t>
+      </w:r>
+      <w:r>
+        <w:rPr>
+          <w:bCs/>
+          <w:b/>
+        </w:rPr>
+        <w:t xml:space="preserve">VanderHeyden’s death.</w:t>
+      </w:r>
+      <w:r>
+        <w:t xml:space="preserve"> </w:t>
+      </w:r>
+      <w:r>
+        <w:t xml:space="preserve">Sixty-four. A man who told anyone who’d listen that he</w:t>
+      </w:r>
+      <w:r>
+        <w:t xml:space="preserve"> </w:t>
+      </w:r>
+      <w:r>
+        <w:t xml:space="preserve">had nothing to do with it could not stop refreshing the coverage of it, the way</w:t>
+      </w:r>
+      <w:r>
+        <w:t xml:space="preserve"> </w:t>
+      </w:r>
+      <w:r>
+        <w:t xml:space="preserve">you worry a loose tooth you swear doesn’t hurt.</w:t>
       </w:r>
     </w:p>
     <w:p>
@@ -155,34 +527,77 @@
         <w:pStyle w:val="BodyText"/>
       </w:pPr>
       <w:r>
-        <w:t xml:space="preserve">Twelve steps is a man getting up for a glass of water. It is not a man beating</w:t>
-      </w:r>
-      <w:r>
-        <w:t xml:space="preserve"> </w:t>
-      </w:r>
-      <w:r>
-        <w:t xml:space="preserve">a woman, moving her body to a field, and scattering her clothes along a</w:t>
-      </w:r>
-      <w:r>
-        <w:t xml:space="preserve"> </w:t>
-      </w:r>
-      <w:r>
-        <w:t xml:space="preserve">freeway. The investigation turned away from Detrie, and for months, it had</w:t>
-      </w:r>
-      <w:r>
-        <w:t xml:space="preserve"> </w:t>
-      </w:r>
-      <w:r>
-        <w:t xml:space="preserve">nowhere else to go.</w:t>
-      </w:r>
-    </w:p>
-    <w:bookmarkStart w:id="20" w:name="the-phone-in-the-evidence-locker"/>
+        <w:t xml:space="preserve">The phone had more to say. It was tied to a Google account, and a warrant to</w:t>
+      </w:r>
+      <w:r>
+        <w:t xml:space="preserve"> </w:t>
+      </w:r>
+      <w:r>
+        <w:t xml:space="preserve">Google produced the</w:t>
+      </w:r>
+      <w:r>
+        <w:t xml:space="preserve"> </w:t>
+      </w:r>
+      <w:r>
+        <w:t xml:space="preserve">“</w:t>
+      </w:r>
+      <w:r>
+        <w:t xml:space="preserve">Dashboard</w:t>
+      </w:r>
+      <w:r>
+        <w:t xml:space="preserve">”</w:t>
+      </w:r>
+      <w:r>
+        <w:t xml:space="preserve"> </w:t>
+      </w:r>
+      <w:r>
+        <w:t xml:space="preserve">location history, a quiet little map of</w:t>
+      </w:r>
+      <w:r>
+        <w:t xml:space="preserve"> </w:t>
+      </w:r>
+      <w:r>
+        <w:t xml:space="preserve">everywhere the phone had been. It put Burch at the bar Nicole visited her last</w:t>
+      </w:r>
+      <w:r>
+        <w:t xml:space="preserve"> </w:t>
+      </w:r>
+      <w:r>
+        <w:t xml:space="preserve">night alive. It put him near her home. It put him at the field where her body</w:t>
+      </w:r>
+      <w:r>
+        <w:t xml:space="preserve"> </w:t>
+      </w:r>
+      <w:r>
+        <w:t xml:space="preserve">was found. And it put him at the on-ramp where her bloody clothes were thrown</w:t>
+      </w:r>
+      <w:r>
+        <w:t xml:space="preserve"> </w:t>
+      </w:r>
+      <w:r>
+        <w:t xml:space="preserve">from a moving car. The phone had ridden shotgun through the entire murder,</w:t>
+      </w:r>
+      <w:r>
+        <w:t xml:space="preserve"> </w:t>
+      </w:r>
+      <w:r>
+        <w:t xml:space="preserve">taking notes, and its owner had personally carried it into a police station and</w:t>
+      </w:r>
+      <w:r>
+        <w:t xml:space="preserve"> </w:t>
+      </w:r>
+      <w:r>
+        <w:t xml:space="preserve">offered it up over a traffic beef.</w:t>
+      </w:r>
+    </w:p>
+    <w:bookmarkEnd w:id="22"/>
+    <w:bookmarkStart w:id="23" w:name="the-story-he-brought-to-court"/>
     <w:p>
       <w:pPr>
         <w:pStyle w:val="Heading2"/>
       </w:pPr>
       <w:r>
-        <w:t xml:space="preserve">The phone in the evidence locker</w:t>
+        <w:t xml:space="preserve">The story he brought to court</w:t>
       </w:r>
     </w:p>
     <w:p>
@@ -190,19 +605,73 @@
         <w:pStyle w:val="FirstParagraph"/>
       </w:pPr>
       <w:r>
-        <w:t xml:space="preserve">Here is where this case becomes something stranger and more instructive than</w:t>
-      </w:r>
-      <w:r>
-        <w:t xml:space="preserve"> </w:t>
-      </w:r>
-      <w:r>
-        <w:t xml:space="preserve">any episode of television: the killer had already given the police everything</w:t>
-      </w:r>
-      <w:r>
-        <w:t xml:space="preserve"> </w:t>
-      </w:r>
-      <w:r>
-        <w:t xml:space="preserve">they needed. Voluntarily. With a signed form.</w:t>
+        <w:t xml:space="preserve">By trial, Burch had no choice but to admit he’d been with Nicole that night; the</w:t>
+      </w:r>
+      <w:r>
+        <w:t xml:space="preserve"> </w:t>
+      </w:r>
+      <w:r>
+        <w:t xml:space="preserve">data had nailed his shoes to the floor. So he built a story around it, and it</w:t>
+      </w:r>
+      <w:r>
+        <w:t xml:space="preserve"> </w:t>
+      </w:r>
+      <w:r>
+        <w:t xml:space="preserve">was a beauty. Yes, he’d met her at a bar. Yes, they’d left together, parked near</w:t>
+      </w:r>
+      <w:r>
+        <w:t xml:space="preserve"> </w:t>
+      </w:r>
+      <w:r>
+        <w:t xml:space="preserve">her house, gotten intimate. And then, he told the jury, he blacked out, and</w:t>
+      </w:r>
+      <w:r>
+        <w:t xml:space="preserve"> </w:t>
+      </w:r>
+      <w:r>
+        <w:t xml:space="preserve">woke up on the ground to find Nicole dead and her boyfriend, Detrie, standing</w:t>
+      </w:r>
+      <w:r>
+        <w:t xml:space="preserve"> </w:t>
+      </w:r>
+      <w:r>
+        <w:t xml:space="preserve">over the two of them with a gun. At gunpoint, Burch said, Detrie forced him to</w:t>
+      </w:r>
+      <w:r>
+        <w:t xml:space="preserve"> </w:t>
+      </w:r>
+      <w:r>
+        <w:t xml:space="preserve">load the body into his own car, drive it to a field, and carry it into the</w:t>
+      </w:r>
+      <w:r>
+        <w:t xml:space="preserve"> </w:t>
+      </w:r>
+      <w:r>
+        <w:t xml:space="preserve">ditch, after which Burch heroically shoved him, sprinted to his vehicle, and</w:t>
+      </w:r>
+      <w:r>
+        <w:t xml:space="preserve"> </w:t>
+      </w:r>
+      <w:r>
+        <w:t xml:space="preserve">escaped, pausing only, on the drive home, to fling Nicole’s clothing out the</w:t>
+      </w:r>
+      <w:r>
+        <w:t xml:space="preserve"> </w:t>
+      </w:r>
+      <w:r>
+        <w:t xml:space="preserve">window</w:t>
+      </w:r>
+      <w:r>
+        <w:t xml:space="preserve"> </w:t>
+      </w:r>
+      <w:r>
+        <w:t xml:space="preserve">“</w:t>
+      </w:r>
+      <w:r>
+        <w:t xml:space="preserve">in a panic.</w:t>
+      </w:r>
+      <w:r>
+        <w:t xml:space="preserve">”</w:t>
       </w:r>
     </w:p>
     <w:p>
@@ -210,49 +679,81 @@
         <w:pStyle w:val="BodyText"/>
       </w:pPr>
       <w:r>
-        <w:t xml:space="preserve">Three weeks after the murder, the Green Bay Police Department, a different</w:t>
-      </w:r>
-      <w:r>
-        <w:t xml:space="preserve"> </w:t>
-      </w:r>
-      <w:r>
-        <w:t xml:space="preserve">agency entirely, was investigating three minor incidents involving the same</w:t>
-      </w:r>
-      <w:r>
-        <w:t xml:space="preserve"> </w:t>
-      </w:r>
-      <w:r>
-        <w:t xml:space="preserve">vehicle: a stolen-vehicle report, a vehicle fire, and a hit-and-run. Their</w:t>
-      </w:r>
-      <w:r>
-        <w:t xml:space="preserve"> </w:t>
-      </w:r>
-      <w:r>
-        <w:t xml:space="preserve">suspect was a man named George Burch. An officer asked Burch if he could take</w:t>
-      </w:r>
-      <w:r>
-        <w:t xml:space="preserve"> </w:t>
-      </w:r>
-      <w:r>
-        <w:t xml:space="preserve">a look at the text messages on his phone to check his alibi. Burch agreed. The</w:t>
-      </w:r>
-      <w:r>
-        <w:t xml:space="preserve"> </w:t>
-      </w:r>
-      <w:r>
-        <w:t xml:space="preserve">officer explained it was easier to download the phone’s contents than to</w:t>
-      </w:r>
-      <w:r>
-        <w:t xml:space="preserve"> </w:t>
-      </w:r>
-      <w:r>
-        <w:t xml:space="preserve">photograph the screen, and Burch said that would be fine. He signed a consent</w:t>
-      </w:r>
-      <w:r>
-        <w:t xml:space="preserve"> </w:t>
-      </w:r>
-      <w:r>
-        <w:t xml:space="preserve">form:</w:t>
+        <w:t xml:space="preserve">It was the sort of tale that requires a very specific listener: one who has</w:t>
+      </w:r>
+      <w:r>
+        <w:t xml:space="preserve"> </w:t>
+      </w:r>
+      <w:r>
+        <w:t xml:space="preserve">never met a coincidence he didn’t adore. It cast, as the villain, the one man in</w:t>
+      </w:r>
+      <w:r>
+        <w:t xml:space="preserve"> </w:t>
+      </w:r>
+      <w:r>
+        <w:t xml:space="preserve">Wisconsin with a twelve-step, machine-printed alibi. And Burch had shared this</w:t>
+      </w:r>
+      <w:r>
+        <w:t xml:space="preserve"> </w:t>
+      </w:r>
+      <w:r>
+        <w:t xml:space="preserve">harrowing gunpoint ordeal with precisely no one, not during the months police</w:t>
+      </w:r>
+      <w:r>
+        <w:t xml:space="preserve"> </w:t>
+      </w:r>
+      <w:r>
+        <w:t xml:space="preserve">publicly begged for tips, not with a single friend, until the witness stand</w:t>
+      </w:r>
+      <w:r>
+        <w:t xml:space="preserve"> </w:t>
+      </w:r>
+      <w:r>
+        <w:t xml:space="preserve">made it convenient.</w:t>
+      </w:r>
+    </w:p>
+    <w:p>
+      <w:pPr>
+        <w:pStyle w:val="BodyText"/>
+      </w:pPr>
+      <w:r>
+        <w:t xml:space="preserve">The jury took the twelve steps over the blackout. George Burch was convicted of</w:t>
+      </w:r>
+      <w:r>
+        <w:t xml:space="preserve"> </w:t>
+      </w:r>
+      <w:r>
+        <w:t xml:space="preserve">first-degree intentional homicide and sentenced to life.</w:t>
+      </w:r>
+    </w:p>
+    <w:bookmarkEnd w:id="23"/>
+    <w:bookmarkStart w:id="24" w:name="the-law-catches-up"/>
+    <w:p>
+      <w:pPr>
+        <w:pStyle w:val="Heading2"/>
+      </w:pPr>
+      <w:r>
+        <w:t xml:space="preserve">The law catches up</w:t>
+      </w:r>
+    </w:p>
+    <w:p>
+      <w:pPr>
+        <w:pStyle w:val="FirstParagraph"/>
+      </w:pPr>
+      <w:r>
+        <w:t xml:space="preserve">Burch appealed all the way to the Wisconsin Supreme Court with a genuinely</w:t>
+      </w:r>
+      <w:r>
+        <w:t xml:space="preserve"> </w:t>
+      </w:r>
+      <w:r>
+        <w:t xml:space="preserve">interesting complaint: sure, he’d signed a consent form, but he’d only meant to</w:t>
+      </w:r>
+      <w:r>
+        <w:t xml:space="preserve"> </w:t>
+      </w:r>
+      <w:r>
+        <w:t xml:space="preserve">show the cops his</w:t>
       </w:r>
       <w:r>
         <w:t xml:space="preserve"> </w:t>
@@ -262,35 +763,28 @@
           <w:iCs/>
           <w:i/>
         </w:rPr>
-        <w:t xml:space="preserve">“</w:t>
-      </w:r>
-      <w:r>
-        <w:rPr>
-          <w:iCs/>
-          <w:i/>
-        </w:rPr>
-        <w:t xml:space="preserve">I, George Stephen Burch . . . voluntarily give . . . permission to</w:t>
-      </w:r>
-      <w:r>
-        <w:rPr>
-          <w:iCs/>
-          <w:i/>
-        </w:rPr>
-        <w:t xml:space="preserve"> </w:t>
-      </w:r>
-      <w:r>
-        <w:rPr>
-          <w:iCs/>
-          <w:i/>
-        </w:rPr>
-        <w:t xml:space="preserve">search my . . . Samsung cellphone.</w:t>
-      </w:r>
-      <w:r>
-        <w:rPr>
-          <w:iCs/>
-          <w:i/>
-        </w:rPr>
-        <w:t xml:space="preserve">”</w:t>
+        <w:t xml:space="preserve">texts</w:t>
+      </w:r>
+      <w:r>
+        <w:t xml:space="preserve">, not donate the entire contents of his phone to a</w:t>
+      </w:r>
+      <w:r>
+        <w:t xml:space="preserve"> </w:t>
+      </w:r>
+      <w:r>
+        <w:t xml:space="preserve">murder investigation that hadn’t even started yet. And once one police</w:t>
+      </w:r>
+      <w:r>
+        <w:t xml:space="preserve"> </w:t>
+      </w:r>
+      <w:r>
+        <w:t xml:space="preserve">department had it, could another one really go rummaging through it months later</w:t>
+      </w:r>
+      <w:r>
+        <w:t xml:space="preserve"> </w:t>
+      </w:r>
+      <w:r>
+        <w:t xml:space="preserve">for a different crime?</w:t>
       </w:r>
     </w:p>
     <w:p>
@@ -298,150 +792,65 @@
         <w:pStyle w:val="BodyText"/>
       </w:pPr>
       <w:r>
-        <w:t xml:space="preserve">The department’s forensic examiner did what forensic examiners do: a full</w:t>
-      </w:r>
-      <w:r>
-        <w:t xml:space="preserve"> </w:t>
-      </w:r>
-      <w:r>
-        <w:t xml:space="preserve">physical extraction of everything on the device, saved to long-term storage,</w:t>
-      </w:r>
-      <w:r>
-        <w:t xml:space="preserve"> </w:t>
-      </w:r>
-      <w:r>
-        <w:t xml:space="preserve">standard practice. Burch got his phone back. The file sat in the archive.</w:t>
-      </w:r>
-    </w:p>
-    <w:p>
-      <w:pPr>
-        <w:pStyle w:val="BodyText"/>
-      </w:pPr>
-      <w:r>
-        <w:t xml:space="preserve">Two months later, the Sheriff’s Office, still working the VanderHeyden</w:t>
-      </w:r>
-      <w:r>
-        <w:t xml:space="preserve"> </w:t>
-      </w:r>
-      <w:r>
-        <w:t xml:space="preserve">homicide, matched a DNA sample from Nicole’s sock to George Burch. When</w:t>
-      </w:r>
-      <w:r>
-        <w:t xml:space="preserve"> </w:t>
-      </w:r>
-      <w:r>
-        <w:t xml:space="preserve">detectives searched local records for prior police contact with him, they</w:t>
-      </w:r>
-      <w:r>
-        <w:t xml:space="preserve"> </w:t>
-      </w:r>
-      <w:r>
-        <w:t xml:space="preserve">found the Green Bay file: the consent form, and a complete copy of everything</w:t>
-      </w:r>
-      <w:r>
-        <w:t xml:space="preserve"> </w:t>
-      </w:r>
-      <w:r>
-        <w:t xml:space="preserve">that had been on his phone.</w:t>
-      </w:r>
-    </w:p>
-    <w:p>
-      <w:pPr>
-        <w:pStyle w:val="BodyText"/>
-      </w:pPr>
-      <w:r>
-        <w:t xml:space="preserve">What was on his phone was damning twice over. His internet history included</w:t>
-      </w:r>
-      <w:r>
-        <w:t xml:space="preserve"> </w:t>
-      </w:r>
-      <w:r>
-        <w:rPr>
-          <w:bCs/>
-          <w:b/>
-        </w:rPr>
-        <w:t xml:space="preserve">sixty-four viewings of news stories about Nicole VanderHeyden’s death</w:t>
-      </w:r>
-      <w:r>
-        <w:t xml:space="preserve">; a</w:t>
-      </w:r>
-      <w:r>
-        <w:t xml:space="preserve"> </w:t>
-      </w:r>
-      <w:r>
-        <w:t xml:space="preserve">man compulsively watching the coverage of a murder he claimed to know nothing</w:t>
-      </w:r>
-      <w:r>
-        <w:t xml:space="preserve"> </w:t>
-      </w:r>
-      <w:r>
-        <w:t xml:space="preserve">about. And the phone pointed to a Google account. With a warrant, detectives</w:t>
-      </w:r>
-      <w:r>
-        <w:t xml:space="preserve"> </w:t>
-      </w:r>
-      <w:r>
-        <w:t xml:space="preserve">obtained Burch’s</w:t>
-      </w:r>
-      <w:r>
-        <w:t xml:space="preserve"> </w:t>
-      </w:r>
-      <w:r>
-        <w:t xml:space="preserve">“</w:t>
-      </w:r>
-      <w:r>
-        <w:t xml:space="preserve">Google Dashboard</w:t>
-      </w:r>
-      <w:r>
-        <w:t xml:space="preserve">”</w:t>
-      </w:r>
-      <w:r>
-        <w:t xml:space="preserve"> </w:t>
-      </w:r>
-      <w:r>
-        <w:t xml:space="preserve">data, and Google’s location records placed</w:t>
-      </w:r>
-      <w:r>
-        <w:t xml:space="preserve"> </w:t>
-      </w:r>
-      <w:r>
-        <w:t xml:space="preserve">his phone at the bar Nicole visited that night, near her residence, at the</w:t>
-      </w:r>
-      <w:r>
-        <w:t xml:space="preserve"> </w:t>
-      </w:r>
-      <w:r>
-        <w:t xml:space="preserve">field where her body was found, and at the on-ramp where her bloody clothing</w:t>
-      </w:r>
-      <w:r>
-        <w:t xml:space="preserve"> </w:t>
-      </w:r>
-      <w:r>
-        <w:t xml:space="preserve">had been thrown from a vehicle.</w:t>
-      </w:r>
-    </w:p>
-    <w:p>
-      <w:pPr>
-        <w:pStyle w:val="BodyText"/>
-      </w:pPr>
-      <w:r>
-        <w:t xml:space="preserve">The phone had followed him through every stop of the crime, and then he had</w:t>
-      </w:r>
-      <w:r>
-        <w:t xml:space="preserve"> </w:t>
-      </w:r>
-      <w:r>
-        <w:t xml:space="preserve">handed it to a police officer over a fender-bender.</w:t>
-      </w:r>
-    </w:p>
-    <w:bookmarkEnd w:id="20"/>
-    <w:bookmarkStart w:id="21" w:name="the-story-he-told-the-jury"/>
+        <w:t xml:space="preserve">In 2021 the court said yes, and yes, though the justices split enough ways to</w:t>
+      </w:r>
+      <w:r>
+        <w:t xml:space="preserve"> </w:t>
+      </w:r>
+      <w:r>
+        <w:t xml:space="preserve">show these are not easy questions in the smartphone age. Burch’s form authorized</w:t>
+      </w:r>
+      <w:r>
+        <w:t xml:space="preserve"> </w:t>
+      </w:r>
+      <w:r>
+        <w:t xml:space="preserve">a search of his cellphone, full stop, with nothing limiting it to text messages;</w:t>
+      </w:r>
+      <w:r>
+        <w:t xml:space="preserve"> </w:t>
+      </w:r>
+      <w:r>
+        <w:t xml:space="preserve">and one department sharing lawfully held evidence with another was, in the trial</w:t>
+      </w:r>
+      <w:r>
+        <w:t xml:space="preserve"> </w:t>
+      </w:r>
+      <w:r>
+        <w:t xml:space="preserve">court’s words, common and long-understood practice. The court also ruled the</w:t>
+      </w:r>
+      <w:r>
+        <w:t xml:space="preserve"> </w:t>
+      </w:r>
+      <w:r>
+        <w:t xml:space="preserve">Fitbit’s step count could go to the jury without an expert first climbing onto</w:t>
+      </w:r>
+      <w:r>
+        <w:t xml:space="preserve"> </w:t>
+      </w:r>
+      <w:r>
+        <w:t xml:space="preserve">the stand to vouch for the science, a mirror image of the fight in the Dabate</w:t>
+      </w:r>
+      <w:r>
+        <w:t xml:space="preserve"> </w:t>
+      </w:r>
+      <w:r>
+        <w:t xml:space="preserve">case a chapter over, where the same little gadget got the full white-glove</w:t>
+      </w:r>
+      <w:r>
+        <w:t xml:space="preserve"> </w:t>
+      </w:r>
+      <w:r>
+        <w:t xml:space="preserve">treatment. Wisconsin let the wristband speak for itself.</w:t>
+      </w:r>
+    </w:p>
+    <w:bookmarkEnd w:id="24"/>
+    <w:bookmarkStart w:id="28" w:name="howd-he-get-caught"/>
     <w:p>
       <w:pPr>
         <w:pStyle w:val="Heading2"/>
       </w:pPr>
       <w:r>
-        <w:t xml:space="preserve">The story he told the jury</w:t>
+        <w:t xml:space="preserve">How’d he get caught?</w:t>
       </w:r>
     </w:p>
     <w:p>
@@ -449,343 +858,55 @@
         <w:pStyle w:val="FirstParagraph"/>
       </w:pPr>
       <w:r>
-        <w:t xml:space="preserve">At trial, Burch admitted he was with Nicole the night she died; he had to,</w:t>
-      </w:r>
-      <w:r>
-        <w:t xml:space="preserve"> </w:t>
-      </w:r>
-      <w:r>
-        <w:t xml:space="preserve">because the data left him no choice. So he told the jury a story. They met at a</w:t>
-      </w:r>
-      <w:r>
-        <w:t xml:space="preserve"> </w:t>
-      </w:r>
-      <w:r>
-        <w:t xml:space="preserve">bar, he said, left together, parked near her house, became intimate. Then, he</w:t>
-      </w:r>
-      <w:r>
-        <w:t xml:space="preserve"> </w:t>
-      </w:r>
-      <w:r>
-        <w:t xml:space="preserve">claimed, he blacked out, and woke up on the ground with Nicole dead and</w:t>
-      </w:r>
-      <w:r>
-        <w:t xml:space="preserve"> </w:t>
-      </w:r>
-      <w:r>
-        <w:rPr>
-          <w:iCs/>
-          <w:i/>
-        </w:rPr>
-        <w:t xml:space="preserve">Detrie</w:t>
-      </w:r>
-      <w:r>
-        <w:t xml:space="preserve"> </w:t>
-      </w:r>
-      <w:r>
-        <w:t xml:space="preserve">standing over them with a gun. In Burch’s telling, the boyfriend</w:t>
-      </w:r>
-      <w:r>
-        <w:t xml:space="preserve"> </w:t>
-      </w:r>
-      <w:r>
-        <w:t xml:space="preserve">forced him at gunpoint to load Nicole’s body into his own vehicle, drive it to</w:t>
-      </w:r>
-      <w:r>
-        <w:t xml:space="preserve"> </w:t>
-      </w:r>
-      <w:r>
-        <w:t xml:space="preserve">the field, and carry her into the ditch. Only then did Burch heroically shove</w:t>
-      </w:r>
-      <w:r>
-        <w:t xml:space="preserve"> </w:t>
-      </w:r>
-      <w:r>
-        <w:t xml:space="preserve">Detrie, run to his vehicle, and escape, pausing, on the drive home, to throw</w:t>
-      </w:r>
-      <w:r>
-        <w:t xml:space="preserve"> </w:t>
-      </w:r>
-      <w:r>
-        <w:t xml:space="preserve">Nicole’s clothing out the window</w:t>
-      </w:r>
-      <w:r>
-        <w:t xml:space="preserve"> </w:t>
-      </w:r>
-      <w:r>
-        <w:t xml:space="preserve">“</w:t>
-      </w:r>
-      <w:r>
-        <w:t xml:space="preserve">in a panic.</w:t>
-      </w:r>
-      <w:r>
-        <w:t xml:space="preserve">”</w:t>
-      </w:r>
-    </w:p>
-    <w:p>
-      <w:pPr>
-        <w:pStyle w:val="BodyText"/>
-      </w:pPr>
-      <w:r>
-        <w:t xml:space="preserve">He had, of course, mentioned this to no one; not during the months police</w:t>
-      </w:r>
-      <w:r>
-        <w:t xml:space="preserve"> </w:t>
-      </w:r>
-      <w:r>
-        <w:t xml:space="preserve">publicly begged for tips, not to a single friend.</w:t>
-      </w:r>
-    </w:p>
-    <w:p>
-      <w:pPr>
-        <w:pStyle w:val="BodyText"/>
-      </w:pPr>
-      <w:r>
-        <w:t xml:space="preserve">The jury was asked to believe that the man whose Fitbit counted twelve steps</w:t>
-      </w:r>
-      <w:r>
-        <w:t xml:space="preserve"> </w:t>
-      </w:r>
-      <w:r>
-        <w:t xml:space="preserve">that night had orchestrated all of it. They deliberated and convicted George</w:t>
-      </w:r>
-      <w:r>
-        <w:t xml:space="preserve"> </w:t>
-      </w:r>
-      <w:r>
-        <w:t xml:space="preserve">Burch of first-degree intentional homicide. He was sentenced to life.</w:t>
-      </w:r>
-    </w:p>
-    <w:bookmarkEnd w:id="21"/>
-    <w:bookmarkStart w:id="22" w:name="what-the-appeal-decided"/>
-    <w:p>
-      <w:pPr>
-        <w:pStyle w:val="Heading2"/>
-      </w:pPr>
-      <w:r>
-        <w:t xml:space="preserve">What the appeal decided</w:t>
-      </w:r>
-    </w:p>
-    <w:p>
-      <w:pPr>
-        <w:pStyle w:val="FirstParagraph"/>
-      </w:pPr>
-      <w:r>
-        <w:t xml:space="preserve">Burch’s appeal reached the Wisconsin Supreme Court, and it is the reason this</w:t>
-      </w:r>
-      <w:r>
-        <w:t xml:space="preserve"> </w:t>
-      </w:r>
-      <w:r>
-        <w:t xml:space="preserve">case matters far beyond Green Bay. He argued the police had betrayed him twice:</w:t>
-      </w:r>
-      <w:r>
-        <w:t xml:space="preserve"> </w:t>
-      </w:r>
-      <w:r>
-        <w:t xml:space="preserve">first when Green Bay downloaded his</w:t>
-      </w:r>
-      <w:r>
-        <w:t xml:space="preserve"> </w:t>
-      </w:r>
-      <w:r>
-        <w:rPr>
-          <w:iCs/>
-          <w:i/>
-        </w:rPr>
-        <w:t xml:space="preserve">entire</w:t>
-      </w:r>
-      <w:r>
-        <w:t xml:space="preserve"> </w:t>
-      </w:r>
-      <w:r>
-        <w:t xml:space="preserve">phone after he’d only discussed</w:t>
-      </w:r>
-      <w:r>
-        <w:t xml:space="preserve"> </w:t>
-      </w:r>
-      <w:r>
-        <w:t xml:space="preserve">text messages, and again when a different department mined that download,</w:t>
-      </w:r>
-      <w:r>
-        <w:t xml:space="preserve"> </w:t>
-      </w:r>
-      <w:r>
-        <w:t xml:space="preserve">months later, for a murder he’d never consented to being investigated for.</w:t>
-      </w:r>
-    </w:p>
-    <w:p>
-      <w:pPr>
-        <w:pStyle w:val="BodyText"/>
-      </w:pPr>
-      <w:r>
-        <w:t xml:space="preserve">The court was unmoved (June 29, 2021, in a decision with several separate</w:t>
-      </w:r>
-      <w:r>
-        <w:t xml:space="preserve"> </w:t>
-      </w:r>
-      <w:r>
-        <w:t xml:space="preserve">writings; the justices themselves disagreed about how far digital consent</w:t>
-      </w:r>
-      <w:r>
-        <w:t xml:space="preserve"> </w:t>
-      </w:r>
-      <w:r>
-        <w:t xml:space="preserve">should stretch). Burch had signed a form authorizing a search of his cellphone,</w:t>
-      </w:r>
-      <w:r>
-        <w:t xml:space="preserve"> </w:t>
-      </w:r>
-      <w:r>
-        <w:t xml:space="preserve">full stop; nothing in his conversation with the officer limited it to texts.</w:t>
-      </w:r>
-      <w:r>
-        <w:t xml:space="preserve"> </w:t>
-      </w:r>
-      <w:r>
-        <w:t xml:space="preserve">And once the data lawfully sat in police storage, one department sharing it</w:t>
-      </w:r>
-      <w:r>
-        <w:t xml:space="preserve"> </w:t>
-      </w:r>
-      <w:r>
-        <w:t xml:space="preserve">with another was, in the circuit court’s words, a common and long-understood</w:t>
-      </w:r>
-      <w:r>
-        <w:t xml:space="preserve"> </w:t>
-      </w:r>
-      <w:r>
-        <w:t xml:space="preserve">practice.</w:t>
-      </w:r>
-    </w:p>
-    <w:p>
-      <w:pPr>
-        <w:pStyle w:val="BodyText"/>
-      </w:pPr>
-      <w:r>
-        <w:t xml:space="preserve">The Fitbit ruling was quieter but just as consequential. Burch, in a mirror</w:t>
-      </w:r>
-      <w:r>
-        <w:t xml:space="preserve"> </w:t>
-      </w:r>
-      <w:r>
-        <w:t xml:space="preserve">image of the fight in</w:t>
-      </w:r>
-      <w:r>
-        <w:t xml:space="preserve"> </w:t>
-      </w:r>
-      <w:r>
-        <w:rPr>
-          <w:iCs/>
-          <w:i/>
-        </w:rPr>
-        <w:t xml:space="preserve">State v. Dabate</w:t>
-      </w:r>
-      <w:r>
-        <w:t xml:space="preserve"> </w:t>
-      </w:r>
-      <w:r>
-        <w:t xml:space="preserve">(Chapter 21), demanded the State</w:t>
-      </w:r>
-      <w:r>
-        <w:t xml:space="preserve"> </w:t>
-      </w:r>
-      <w:r>
-        <w:t xml:space="preserve">produce an expert to prove the science of Detrie’s Fitbit before the twelve</w:t>
-      </w:r>
-      <w:r>
-        <w:t xml:space="preserve"> </w:t>
-      </w:r>
-      <w:r>
-        <w:t xml:space="preserve">steps could clear his rival. The court held the step-count records could come</w:t>
-      </w:r>
-      <w:r>
-        <w:t xml:space="preserve"> </w:t>
-      </w:r>
-      <w:r>
-        <w:t xml:space="preserve">in</w:t>
-      </w:r>
-      <w:r>
-        <w:t xml:space="preserve"> </w:t>
-      </w:r>
-      <w:r>
-        <w:rPr>
-          <w:iCs/>
-          <w:i/>
-        </w:rPr>
-        <w:t xml:space="preserve">without</w:t>
-      </w:r>
-      <w:r>
-        <w:t xml:space="preserve"> </w:t>
-      </w:r>
-      <w:r>
-        <w:t xml:space="preserve">expert testimony on the underlying technology. Where Connecticut</w:t>
-      </w:r>
-      <w:r>
-        <w:t xml:space="preserve"> </w:t>
-      </w:r>
-      <w:r>
-        <w:t xml:space="preserve">would put a Columbia professor on the stand to validate the device, Wisconsin</w:t>
-      </w:r>
-      <w:r>
-        <w:t xml:space="preserve"> </w:t>
-      </w:r>
-      <w:r>
-        <w:t xml:space="preserve">let the little band speak for itself.</w:t>
-      </w:r>
-    </w:p>
-    <w:bookmarkEnd w:id="22"/>
-    <w:bookmarkStart w:id="26" w:name="howd-he-get-caught"/>
-    <w:p>
-      <w:pPr>
-        <w:pStyle w:val="Heading2"/>
-      </w:pPr>
-      <w:r>
-        <w:t xml:space="preserve">How’d he get caught?</w:t>
-      </w:r>
-    </w:p>
-    <w:p>
-      <w:pPr>
-        <w:pStyle w:val="FirstParagraph"/>
-      </w:pPr>
-      <w:r>
-        <w:t xml:space="preserve">He was caught by his own helpfulness. A murderer, three weeks clear of the</w:t>
-      </w:r>
-      <w:r>
-        <w:t xml:space="preserve"> </w:t>
-      </w:r>
-      <w:r>
-        <w:t xml:space="preserve">crime, signed a consent form in a trivial case to make himself look</w:t>
-      </w:r>
-      <w:r>
-        <w:t xml:space="preserve"> </w:t>
-      </w:r>
-      <w:r>
-        <w:t xml:space="preserve">cooperative, and handed police a complete map of the killing: his phone at</w:t>
-      </w:r>
-      <w:r>
-        <w:t xml:space="preserve"> </w:t>
-      </w:r>
-      <w:r>
-        <w:t xml:space="preserve">the bar, at her house, at the field, at the on-ramp, and sixty-four anxious</w:t>
-      </w:r>
-      <w:r>
-        <w:t xml:space="preserve"> </w:t>
-      </w:r>
-      <w:r>
-        <w:t xml:space="preserve">returns to the news coverage. Meanwhile, the man the arithmetic said should go</w:t>
-      </w:r>
-      <w:r>
-        <w:t xml:space="preserve"> </w:t>
-      </w:r>
-      <w:r>
-        <w:t xml:space="preserve">to prison was saved by a $99 wristband that had counted him fast asleep.</w:t>
-      </w:r>
-      <w:r>
-        <w:t xml:space="preserve"> </w:t>
-      </w:r>
-      <w:r>
-        <w:t xml:space="preserve">Twelve steps.</w:t>
+        <w:t xml:space="preserve">By being helpful. Somewhere out there is a version of George Burch who keeps his</w:t>
+      </w:r>
+      <w:r>
+        <w:t xml:space="preserve"> </w:t>
+      </w:r>
+      <w:r>
+        <w:t xml:space="preserve">mouth shut and his phone in his pocket, and that man is a much harder case. The</w:t>
+      </w:r>
+      <w:r>
+        <w:t xml:space="preserve"> </w:t>
+      </w:r>
+      <w:r>
+        <w:t xml:space="preserve">real one signed a form over a fender-bender and gift-wrapped a map of the</w:t>
+      </w:r>
+      <w:r>
+        <w:t xml:space="preserve"> </w:t>
+      </w:r>
+      <w:r>
+        <w:t xml:space="preserve">killing: his phone at the bar, at her house, at the field, at the on-ramp, and</w:t>
+      </w:r>
+      <w:r>
+        <w:t xml:space="preserve"> </w:t>
+      </w:r>
+      <w:r>
+        <w:t xml:space="preserve">sixty-four anxious little pilgrimages back to the news. Meanwhile the man the</w:t>
+      </w:r>
+      <w:r>
+        <w:t xml:space="preserve"> </w:t>
+      </w:r>
+      <w:r>
+        <w:t xml:space="preserve">odds had elected, the boyfriend, the easy answer, was saved by a nine-dollar-a-month</w:t>
+      </w:r>
+      <w:r>
+        <w:t xml:space="preserve"> </w:t>
+      </w:r>
+      <w:r>
+        <w:t xml:space="preserve">gadget that had clocked him doing twelve steps’ worth of nothing. The oldest</w:t>
+      </w:r>
+      <w:r>
+        <w:t xml:space="preserve"> </w:t>
+      </w:r>
+      <w:r>
+        <w:t xml:space="preserve">rule in the detective’s book says look at the one she loved. The newest footnote</w:t>
+      </w:r>
+      <w:r>
+        <w:t xml:space="preserve"> </w:t>
+      </w:r>
+      <w:r>
+        <w:t xml:space="preserve">says check his wrist first.</w:t>
       </w:r>
     </w:p>
     <w:p>
@@ -834,7 +955,7 @@
       <w:r>
         <w:t xml:space="preserve"> </w:t>
       </w:r>
-      <w:hyperlink r:id="rId23">
+      <w:hyperlink r:id="rId25">
         <w:r>
           <w:rPr>
             <w:rStyle w:val="Hyperlink"/>
@@ -851,7 +972,7 @@
       <w:r>
         <w:t xml:space="preserve"> </w:t>
       </w:r>
-      <w:hyperlink r:id="rId24">
+      <w:hyperlink r:id="rId26">
         <w:r>
           <w:rPr>
             <w:rStyle w:val="Hyperlink"/>
@@ -868,7 +989,7 @@
       <w:r>
         <w:t xml:space="preserve"> </w:t>
       </w:r>
-      <w:hyperlink r:id="rId25">
+      <w:hyperlink r:id="rId27">
         <w:r>
           <w:rPr>
             <w:rStyle w:val="Hyperlink"/>
@@ -892,8 +1013,8 @@
         <w:t xml:space="preserve">Fitbit rulings follow in the Discussion.</w:t>
       </w:r>
     </w:p>
-    <w:bookmarkEnd w:id="26"/>
-    <w:bookmarkEnd w:id="27"/>
+    <w:bookmarkEnd w:id="28"/>
+    <w:bookmarkEnd w:id="29"/>
     <w:sectPr/>
   </w:body>
 </w:document>

</xml_diff>